<commit_message>
FIM DO CAP 3 START 4
</commit_message>
<xml_diff>
--- a/docs/TCC_ENG_MEC_N8N.docx
+++ b/docs/TCC_ENG_MEC_N8N.docx
@@ -1008,8 +1008,6 @@
         </w:rPr>
         <w:t>por ter aceitado me orientar mesmo no curto período em que estivemos juntos, contribuindo de forma essencial para a conclusão desta etapa.</w:t>
       </w:r>
-      <w:bookmarkStart w:id="2" w:name="_GoBack"/>
-      <w:bookmarkEnd w:id="2"/>
     </w:p>
     <w:p>
       <w:pPr>
@@ -1033,21 +1031,7 @@
         <w:rPr>
           <w:szCs w:val="24"/>
         </w:rPr>
-        <w:t xml:space="preserve">o ensino superior, construir amizades, conhecer profissionais e aprofundar </w:t>
-      </w:r>
-      <w:proofErr w:type="gramStart"/>
-      <w:r>
-        <w:rPr>
-          <w:szCs w:val="24"/>
-        </w:rPr>
-        <w:t>meus</w:t>
-      </w:r>
-      <w:proofErr w:type="gramEnd"/>
-      <w:r>
-        <w:rPr>
-          <w:szCs w:val="24"/>
-        </w:rPr>
-        <w:t xml:space="preserve"> conhecimentos no curso de Engenharia Mecatrônica.</w:t>
+        <w:t>o ensino superior, construir amizades, conhecer profissionais e aprofundar meus conhecimentos no curso de Engenharia Mecatrônica.</w:t>
       </w:r>
     </w:p>
     <w:p>
@@ -1101,12 +1085,12 @@
               </w:numPr>
               <w:outlineLvl w:val="0"/>
             </w:pPr>
-            <w:bookmarkStart w:id="3" w:name="_Toc365129122"/>
+            <w:bookmarkStart w:id="2" w:name="_Toc365129122"/>
             <w:r>
               <w:lastRenderedPageBreak/>
               <w:t>Resumo</w:t>
             </w:r>
-            <w:bookmarkEnd w:id="3"/>
+            <w:bookmarkEnd w:id="2"/>
             <w:r>
               <w:br/>
             </w:r>
@@ -1286,12 +1270,12 @@
               </w:numPr>
               <w:outlineLvl w:val="0"/>
             </w:pPr>
-            <w:bookmarkStart w:id="4" w:name="_Toc365129123"/>
+            <w:bookmarkStart w:id="3" w:name="_Toc365129123"/>
             <w:r>
               <w:lastRenderedPageBreak/>
               <w:t>Abstract</w:t>
             </w:r>
-            <w:bookmarkEnd w:id="4"/>
+            <w:bookmarkEnd w:id="3"/>
           </w:p>
           <w:p>
             <w:pPr>
@@ -1419,7 +1403,7 @@
           <w:numId w:val="0"/>
         </w:numPr>
       </w:pPr>
-      <w:bookmarkStart w:id="5" w:name="_Toc365129124"/>
+      <w:bookmarkStart w:id="4" w:name="_Toc365129124"/>
       <w:r>
         <w:lastRenderedPageBreak/>
         <w:t xml:space="preserve">Lista de </w:t>
@@ -1427,7 +1411,7 @@
       <w:r>
         <w:t>Ilustrações</w:t>
       </w:r>
-      <w:bookmarkEnd w:id="5"/>
+      <w:bookmarkEnd w:id="4"/>
     </w:p>
     <w:p>
       <w:pPr>
@@ -1488,7 +1472,15 @@
             <w:noProof/>
             <w:lang w:val="pt-BR"/>
           </w:rPr>
-          <w:t>Figura 1 – Painel de edição</w:t>
+          <w:t>Figura 1 – Painel de e</w:t>
+        </w:r>
+        <w:r>
+          <w:rPr>
+            <w:rStyle w:val="Hyperlink"/>
+            <w:noProof/>
+            <w:lang w:val="pt-BR"/>
+          </w:rPr>
+          <w:t>dição</w:t>
         </w:r>
         <w:r>
           <w:rPr>
@@ -1545,7 +1537,15 @@
             <w:noProof/>
             <w:lang w:val="pt-BR"/>
           </w:rPr>
-          <w:t>Figura 2 – Agente Arquiteto Backend</w:t>
+          <w:t>Figura 2 – Agente arquiteto b</w:t>
+        </w:r>
+        <w:r>
+          <w:rPr>
+            <w:rStyle w:val="Hyperlink"/>
+            <w:noProof/>
+            <w:lang w:val="pt-BR"/>
+          </w:rPr>
+          <w:t>ackend</w:t>
         </w:r>
         <w:r>
           <w:rPr>
@@ -1659,7 +1659,15 @@
             <w:noProof/>
             <w:lang w:val="pt-BR"/>
           </w:rPr>
-          <w:t>Figura 4 – Nó Agente de IA</w:t>
+          <w:t>Figura 4 – Nó a</w:t>
+        </w:r>
+        <w:r>
+          <w:rPr>
+            <w:rStyle w:val="Hyperlink"/>
+            <w:noProof/>
+            <w:lang w:val="pt-BR"/>
+          </w:rPr>
+          <w:t>gente de IA</w:t>
         </w:r>
         <w:r>
           <w:rPr>
@@ -1716,7 +1724,7 @@
             <w:noProof/>
             <w:lang w:val="pt-BR"/>
           </w:rPr>
-          <w:t>Figura 5</w:t>
+          <w:t>Figura 5 – Fluxo do s</w:t>
         </w:r>
         <w:r>
           <w:rPr>
@@ -1724,7 +1732,7 @@
             <w:noProof/>
             <w:lang w:val="pt-BR"/>
           </w:rPr>
-          <w:t xml:space="preserve"> – </w:t>
+          <w:t>istema</w:t>
         </w:r>
         <w:r>
           <w:rPr>
@@ -1732,7 +1740,7 @@
             <w:noProof/>
             <w:lang w:val="pt-BR"/>
           </w:rPr>
-          <w:t>Fluxo do Sistema</w:t>
+          <w:t xml:space="preserve"> simplificado</w:t>
         </w:r>
         <w:r>
           <w:rPr>
@@ -1751,6 +1759,63 @@
             <w:lang w:val="pt-BR"/>
           </w:rPr>
           <w:t>11</w:t>
+        </w:r>
+      </w:hyperlink>
+      <w:r>
+        <w:rPr>
+          <w:rStyle w:val="Hyperlink"/>
+          <w:noProof/>
+          <w:lang w:val="pt-BR"/>
+        </w:rPr>
+        <w:br/>
+      </w:r>
+      <w:r>
+        <w:rPr>
+          <w:lang w:val="pt-BR"/>
+        </w:rPr>
+        <w:fldChar w:fldCharType="begin"/>
+      </w:r>
+      <w:r>
+        <w:rPr>
+          <w:lang w:val="pt-BR"/>
+        </w:rPr>
+        <w:instrText xml:space="preserve"> TOC \h \z \c "Figura" </w:instrText>
+      </w:r>
+      <w:r>
+        <w:rPr>
+          <w:lang w:val="pt-BR"/>
+        </w:rPr>
+        <w:fldChar w:fldCharType="separate"/>
+      </w:r>
+      <w:hyperlink w:anchor="_Toc365129144" w:history="1">
+        <w:r>
+          <w:t xml:space="preserve"> </w:t>
+        </w:r>
+        <w:r>
+          <w:rPr>
+            <w:rStyle w:val="Hyperlink"/>
+            <w:noProof/>
+            <w:lang w:val="pt-BR"/>
+          </w:rPr>
+          <w:t>Figura 6 – Interface do Insomnia</w:t>
+        </w:r>
+        <w:r>
+          <w:rPr>
+            <w:rStyle w:val="Hyperlink"/>
+            <w:noProof/>
+            <w:webHidden/>
+            <w:lang w:val="pt-BR"/>
+          </w:rPr>
+          <w:tab/>
+        </w:r>
+        <w:r>
+          <w:rPr>
+            <w:rStyle w:val="Hyperlink"/>
+            <w:noProof/>
+            <w:webHidden/>
+            <w:lang w:val="pt-BR"/>
+          </w:rPr>
+          <w:t>13</w:t>
         </w:r>
       </w:hyperlink>
     </w:p>
@@ -1781,6 +1846,9 @@
           <w:tab w:val="right" w:leader="underscore" w:pos="9062"/>
         </w:tabs>
         <w:rPr>
+          <w:noProof/>
+          <w:color w:val="0000FF" w:themeColor="hyperlink"/>
+          <w:u w:val="single"/>
           <w:lang w:val="pt-BR"/>
         </w:rPr>
       </w:pPr>
@@ -1798,9 +1866,6 @@
           <w:tab w:val="right" w:leader="underscore" w:pos="9062"/>
         </w:tabs>
         <w:rPr>
-          <w:noProof/>
-          <w:color w:val="0000FF" w:themeColor="hyperlink"/>
-          <w:u w:val="single"/>
           <w:lang w:val="pt-BR"/>
         </w:rPr>
       </w:pPr>
@@ -1817,6 +1882,27 @@
         <w:tabs>
           <w:tab w:val="right" w:leader="underscore" w:pos="9062"/>
         </w:tabs>
+        <w:rPr>
+          <w:noProof/>
+          <w:color w:val="0000FF" w:themeColor="hyperlink"/>
+          <w:u w:val="single"/>
+          <w:lang w:val="pt-BR"/>
+        </w:rPr>
+      </w:pPr>
+      <w:r>
+        <w:rPr>
+          <w:lang w:val="pt-BR"/>
+        </w:rPr>
+        <w:fldChar w:fldCharType="end"/>
+      </w:r>
+    </w:p>
+    <w:p>
+      <w:pPr>
+        <w:pStyle w:val="ndicedeilustraes"/>
+        <w:tabs>
+          <w:tab w:val="right" w:leader="underscore" w:pos="9062"/>
+        </w:tabs>
+        <w:jc w:val="center"/>
         <w:rPr>
           <w:noProof/>
           <w:color w:val="0000FF" w:themeColor="hyperlink"/>
@@ -1943,11 +2029,11 @@
           <w:numId w:val="0"/>
         </w:numPr>
       </w:pPr>
-      <w:bookmarkStart w:id="6" w:name="_Toc365129126"/>
+      <w:bookmarkStart w:id="5" w:name="_Toc365129126"/>
       <w:r>
         <w:t>Lista de abreviaturas e siglas</w:t>
       </w:r>
-      <w:bookmarkEnd w:id="6"/>
+      <w:bookmarkEnd w:id="5"/>
     </w:p>
     <w:p>
       <w:pPr>
@@ -2057,6 +2143,42 @@
       <w:r>
         <w:tab/>
         <w:t>Large Language Models</w:t>
+      </w:r>
+    </w:p>
+    <w:p>
+      <w:pPr>
+        <w:ind w:firstLine="0"/>
+        <w:rPr>
+          <w:lang w:val="pt-BR"/>
+        </w:rPr>
+      </w:pPr>
+      <w:r>
+        <w:t>MVP</w:t>
+      </w:r>
+      <w:r>
+        <w:tab/>
+      </w:r>
+      <w:r>
+        <w:tab/>
+        <w:t>Minimum Viable Product</w:t>
+      </w:r>
+    </w:p>
+    <w:p>
+      <w:pPr>
+        <w:ind w:firstLine="0"/>
+        <w:rPr>
+          <w:lang w:val="pt-BR"/>
+        </w:rPr>
+      </w:pPr>
+      <w:r>
+        <w:t>MVP</w:t>
+      </w:r>
+      <w:r>
+        <w:tab/>
+      </w:r>
+      <w:r>
+        <w:tab/>
+        <w:t>Minimum Viable Product</w:t>
       </w:r>
     </w:p>
     <w:p>
@@ -2068,6 +2190,25 @@
           <w:lang w:val="pt-BR"/>
         </w:rPr>
       </w:pPr>
+      <w:r>
+        <w:rPr>
+          <w:lang w:val="pt-BR"/>
+        </w:rPr>
+        <w:t xml:space="preserve">JWT </w:t>
+      </w:r>
+      <w:r>
+        <w:rPr>
+          <w:lang w:val="pt-BR"/>
+        </w:rPr>
+        <w:tab/>
+      </w:r>
+      <w:r>
+        <w:rPr>
+          <w:lang w:val="pt-BR"/>
+        </w:rPr>
+        <w:tab/>
+        <w:t>JSON Web Token</w:t>
+      </w:r>
       <w:r>
         <w:rPr>
           <w:lang w:val="pt-BR"/>
@@ -2093,11 +2234,11 @@
           <w:numId w:val="0"/>
         </w:numPr>
       </w:pPr>
-      <w:bookmarkStart w:id="7" w:name="_Toc365129128"/>
+      <w:bookmarkStart w:id="6" w:name="_Toc365129128"/>
       <w:r>
         <w:t>Sumário</w:t>
       </w:r>
-      <w:bookmarkEnd w:id="7"/>
+      <w:bookmarkEnd w:id="6"/>
     </w:p>
     <w:p>
       <w:pPr>
@@ -3161,21 +3302,7 @@
             <w:rStyle w:val="Hyperlink"/>
             <w:noProof/>
           </w:rPr>
-          <w:t>3.2</w:t>
-        </w:r>
-        <w:r>
-          <w:rPr>
-            <w:rStyle w:val="Hyperlink"/>
-            <w:noProof/>
-          </w:rPr>
-          <w:t xml:space="preserve"> </w:t>
-        </w:r>
-        <w:r>
-          <w:rPr>
-            <w:rStyle w:val="Hyperlink"/>
-            <w:noProof/>
-          </w:rPr>
-          <w:t>Ambiente e Ferramentas Utilizadas</w:t>
+          <w:t>3.2 Ambiente e Ferramentas Utilizadas</w:t>
         </w:r>
         <w:r>
           <w:rPr>
@@ -3183,12 +3310,6 @@
             <w:webHidden/>
           </w:rPr>
           <w:tab/>
-        </w:r>
-        <w:r>
-          <w:rPr>
-            <w:noProof/>
-            <w:webHidden/>
-          </w:rPr>
           <w:t>12</w:t>
         </w:r>
       </w:hyperlink>
@@ -3211,21 +3332,7 @@
             <w:rStyle w:val="Hyperlink"/>
             <w:noProof/>
           </w:rPr>
-          <w:t>3.3</w:t>
-        </w:r>
-        <w:r>
-          <w:rPr>
-            <w:rStyle w:val="Hyperlink"/>
-            <w:noProof/>
-          </w:rPr>
-          <w:t xml:space="preserve"> </w:t>
-        </w:r>
-        <w:r>
-          <w:rPr>
-            <w:rStyle w:val="Hyperlink"/>
-            <w:noProof/>
-          </w:rPr>
-          <w:t>Coleta e Integração dos Dados</w:t>
+          <w:t>3.3 Coleta e Integração dos Dados</w:t>
         </w:r>
         <w:r>
           <w:rPr>
@@ -3233,7 +3340,14 @@
             <w:webHidden/>
           </w:rPr>
           <w:tab/>
-          <w:t>12</w:t>
+          <w:t>1</w:t>
+        </w:r>
+        <w:r>
+          <w:rPr>
+            <w:noProof/>
+            <w:webHidden/>
+          </w:rPr>
+          <w:t>4</w:t>
         </w:r>
       </w:hyperlink>
     </w:p>
@@ -3255,21 +3369,7 @@
             <w:rStyle w:val="Hyperlink"/>
             <w:noProof/>
           </w:rPr>
-          <w:t>3.4</w:t>
-        </w:r>
-        <w:r>
-          <w:rPr>
-            <w:rStyle w:val="Hyperlink"/>
-            <w:noProof/>
-          </w:rPr>
-          <w:t xml:space="preserve"> </w:t>
-        </w:r>
-        <w:r>
-          <w:rPr>
-            <w:rStyle w:val="Hyperlink"/>
-            <w:noProof/>
-          </w:rPr>
-          <w:t>Desenvolvimento do Fluxo Automatizado</w:t>
+          <w:t>3.4 Desenvolvimento do Fluxo Automatizado</w:t>
         </w:r>
         <w:r>
           <w:rPr>
@@ -3277,7 +3377,14 @@
             <w:webHidden/>
           </w:rPr>
           <w:tab/>
-          <w:t>12</w:t>
+          <w:t>1</w:t>
+        </w:r>
+        <w:r>
+          <w:rPr>
+            <w:noProof/>
+            <w:webHidden/>
+          </w:rPr>
+          <w:t>4</w:t>
         </w:r>
       </w:hyperlink>
     </w:p>
@@ -3320,7 +3427,14 @@
             <w:noProof/>
             <w:webHidden/>
           </w:rPr>
-          <w:t>12</w:t>
+          <w:t>1</w:t>
+        </w:r>
+        <w:r>
+          <w:rPr>
+            <w:noProof/>
+            <w:webHidden/>
+          </w:rPr>
+          <w:t>6</w:t>
         </w:r>
       </w:hyperlink>
     </w:p>
@@ -3367,9 +3481,7 @@
           <w:tab w:val="right" w:leader="dot" w:pos="9062"/>
         </w:tabs>
         <w:rPr>
-          <w:rFonts w:asciiTheme="minorHAnsi" w:eastAsiaTheme="minorEastAsia" w:hAnsiTheme="minorHAnsi"/>
           <w:noProof/>
-          <w:sz w:val="22"/>
         </w:rPr>
       </w:pPr>
       <w:hyperlink w:anchor="_Toc365129138" w:history="1">
@@ -3436,18 +3548,19 @@
         <w:tabs>
           <w:tab w:val="right" w:leader="dot" w:pos="9062"/>
         </w:tabs>
-        <w:ind w:left="851" w:firstLine="0"/>
-        <w:rPr>
+        <w:rPr>
+          <w:rFonts w:asciiTheme="minorHAnsi" w:eastAsiaTheme="minorEastAsia" w:hAnsiTheme="minorHAnsi"/>
           <w:noProof/>
-        </w:rPr>
-      </w:pPr>
-      <w:hyperlink w:anchor="_Toc365129139" w:history="1">
+          <w:sz w:val="22"/>
+        </w:rPr>
+      </w:pPr>
+      <w:hyperlink w:anchor="_Toc365129138" w:history="1">
         <w:r>
           <w:rPr>
             <w:rStyle w:val="Hyperlink"/>
             <w:noProof/>
           </w:rPr>
-          <w:t>7 Conclusões</w:t>
+          <w:t>7 Conclusão</w:t>
         </w:r>
         <w:r>
           <w:rPr>
@@ -3468,7 +3581,7 @@
             <w:noProof/>
             <w:webHidden/>
           </w:rPr>
-          <w:instrText xml:space="preserve"> PAGEREF _Toc365129139 \h </w:instrText>
+          <w:instrText xml:space="preserve"> PAGEREF _Toc365129138 \h </w:instrText>
         </w:r>
         <w:r>
           <w:rPr>
@@ -3488,7 +3601,7 @@
             <w:noProof/>
             <w:webHidden/>
           </w:rPr>
-          <w:t>11</w:t>
+          <w:t>10</w:t>
         </w:r>
         <w:r>
           <w:rPr>
@@ -3608,12 +3721,12 @@
       <w:pPr>
         <w:pStyle w:val="Ttulo1"/>
       </w:pPr>
-      <w:bookmarkStart w:id="8" w:name="_Toc365129129"/>
+      <w:bookmarkStart w:id="7" w:name="_Toc365129129"/>
       <w:r>
         <w:lastRenderedPageBreak/>
         <w:t>Introdução</w:t>
       </w:r>
-      <w:bookmarkEnd w:id="8"/>
+      <w:bookmarkEnd w:id="7"/>
     </w:p>
     <w:p>
       <w:r>
@@ -3625,7 +3738,23 @@
       </w:r>
       <w:proofErr w:type="gramEnd"/>
       <w:r>
-        <w:t xml:space="preserve"> atuação humana em tarefas repetitivas ou altamente complexas. Entre todas as capacidades oferecidas pela IA, a mais impactante é sua habilidade de relacionar informações e identificar padrões que muitas vezes não são percebidas por analistas, permitindo análises mais rápidas, precisas e profundas. Além desses avanços, estudos mostram que a incorporação da IA ​​no ambiente corporativo está reorganizando profundamente as estruturas de emprego e os perfis profissionais. A pesquisa da OCDE (2021) indica que a automação via IA não se limita a tarefas rotineiras, mas também avança para tarefas cognitivas mais sofisticadas. De acordo com o relatório OECD Employment Outlook 2023, o principal sinal dessa transição não é a perda de empregos, </w:t>
+        <w:t xml:space="preserve"> atuação humana em tarefas repetitivas ou altamente complexas. Entre todas as capacidades oferecidas pela IA, a mais impactante é sua habilidade de relacionar informações e identificar padrões que muitas vezes não são percebidas por analistas, permitindo análises mais rápidas, precisas e profundas. Além desses avanços, estudos mostram que </w:t>
+      </w:r>
+      <w:proofErr w:type="gramStart"/>
+      <w:r>
+        <w:t>a</w:t>
+      </w:r>
+      <w:proofErr w:type="gramEnd"/>
+      <w:r>
+        <w:t xml:space="preserve"> incorporação da IA ​​no ambiente corporativo está reorganizando profundamente as estruturas de emprego e os perfis profissionais. A pesquisa da OCDE (2021) indica que </w:t>
+      </w:r>
+      <w:proofErr w:type="gramStart"/>
+      <w:r>
+        <w:t>a</w:t>
+      </w:r>
+      <w:proofErr w:type="gramEnd"/>
+      <w:r>
+        <w:t xml:space="preserve"> automação via IA não se limita a tarefas rotineiras, mas também avança para tarefas cognitivas mais sofisticadas. De acordo com o relatório OECD Employment Outlook 2023, o principal sinal dessa transição não é a perda de empregos, </w:t>
       </w:r>
       <w:proofErr w:type="gramStart"/>
       <w:r>
@@ -4079,7 +4208,15 @@
     </w:p>
     <w:p>
       <w:r>
-        <w:t xml:space="preserve">Este trabalho caracteriza-se como uma pesquisa exploratória de natureza aplicada, baseada na implementação prática de fluxos automatizados utilizando a plataforma </w:t>
+        <w:t xml:space="preserve">Este trabalho caracteriza-se </w:t>
+      </w:r>
+      <w:proofErr w:type="gramStart"/>
+      <w:r>
+        <w:t>como</w:t>
+      </w:r>
+      <w:proofErr w:type="gramEnd"/>
+      <w:r>
+        <w:t xml:space="preserve"> uma pesquisa exploratória de natureza aplicada, baseada na implementação prática de fluxos automatizados utilizando a plataforma </w:t>
       </w:r>
       <w:r>
         <w:rPr>
@@ -4214,7 +4351,7 @@
       <w:pPr>
         <w:pStyle w:val="Ttulo2"/>
       </w:pPr>
-      <w:bookmarkStart w:id="9" w:name="_Toc365129133"/>
+      <w:bookmarkStart w:id="8" w:name="_Toc365129133"/>
       <w:r>
         <w:t>Inteligência Artificial</w:t>
       </w:r>
@@ -4393,13 +4530,13 @@
         <w:rPr>
           <w:lang w:val="pt-BR"/>
         </w:rPr>
-        <w:t>Agente A</w:t>
-      </w:r>
-      <w:r>
-        <w:rPr>
-          <w:lang w:val="pt-BR"/>
-        </w:rPr>
-        <w:t>rquiteto de Backend</w:t>
+        <w:t>Agente arquiteto de b</w:t>
+      </w:r>
+      <w:r>
+        <w:rPr>
+          <w:lang w:val="pt-BR"/>
+        </w:rPr>
+        <w:t>ackend</w:t>
       </w:r>
     </w:p>
     <w:p>
@@ -4937,7 +5074,13 @@
         <w:rPr>
           <w:lang w:val="pt-BR"/>
         </w:rPr>
-        <w:t>Nó Agente de IA</w:t>
+        <w:t>Nó a</w:t>
+      </w:r>
+      <w:r>
+        <w:rPr>
+          <w:lang w:val="pt-BR"/>
+        </w:rPr>
+        <w:t>gente de IA</w:t>
       </w:r>
     </w:p>
     <w:p>
@@ -5203,6 +5346,12 @@
         </w:rPr>
         <w:t>Fluxo do sistema</w:t>
       </w:r>
+      <w:r>
+        <w:rPr>
+          <w:lang w:val="pt-BR"/>
+        </w:rPr>
+        <w:t xml:space="preserve"> simplificado</w:t>
+      </w:r>
     </w:p>
     <w:p>
       <w:pPr>
@@ -5219,9 +5368,9 @@
         </w:rPr>
         <w:drawing>
           <wp:inline distT="0" distB="0" distL="0" distR="0">
-            <wp:extent cx="4581525" cy="6210300"/>
+            <wp:extent cx="4581525" cy="6200775"/>
             <wp:effectExtent l="0" t="0" r="0" b="0"/>
-            <wp:docPr id="2" name="Imagem 2"/>
+            <wp:docPr id="1" name="Imagem 1"/>
             <wp:cNvGraphicFramePr>
               <a:graphicFrameLocks xmlns:a="http://schemas.openxmlformats.org/drawingml/2006/main" noChangeAspect="1"/>
             </wp:cNvGraphicFramePr>
@@ -5229,7 +5378,7 @@
               <a:graphicData uri="http://schemas.openxmlformats.org/drawingml/2006/picture">
                 <pic:pic xmlns:pic="http://schemas.openxmlformats.org/drawingml/2006/picture">
                   <pic:nvPicPr>
-                    <pic:cNvPr id="2" name="Diagrama sem nome.drawio.png"/>
+                    <pic:cNvPr id="1" name="Diagrama sem nome.drawio.png"/>
                     <pic:cNvPicPr/>
                   </pic:nvPicPr>
                   <pic:blipFill>
@@ -5247,7 +5396,7 @@
                   <pic:spPr>
                     <a:xfrm>
                       <a:off x="0" y="0"/>
-                      <a:ext cx="4581525" cy="6210300"/>
+                      <a:ext cx="4581525" cy="6200775"/>
                     </a:xfrm>
                     <a:prstGeom prst="rect">
                       <a:avLst/>
@@ -5302,13 +5451,322 @@
     </w:p>
     <w:p>
       <w:pPr>
+        <w:rPr>
+          <w:lang w:val="pt-BR" w:eastAsia="pt-BR"/>
+        </w:rPr>
+      </w:pPr>
+      <w:r>
+        <w:rPr>
+          <w:lang w:val="pt-BR" w:eastAsia="pt-BR"/>
+        </w:rPr>
+        <w:t>Para o desenvolvimento do fluxo de trabalho proposto neste estudo, foram selecionadas diferentes tecnologias focadas em automação de processos, integração de sistemas, processamento de dados e uso de Inteligência Artificial. A escolha dessas ferramentas considerou fatores como flexibilidade, escalabilidade, facilidade de integração e viabilidade de implementação. Antes de implantar a solução em um ambiente de produção, um Produto Mínimo Viável (MVP) foi desenvolvido em um ambiente local para validar os requisitos iniciais do projeto, identificar possíveis desafios técnicos e estimar a complexidade necessária para construir a solução final. Para a implementação desta primeira versão, foi utilizada a tecnologia Docker, responsável por criar e gerenciar o ambiente de execução do aplicativo. A partir da imagem oficial do n8n, foi possível configurar rapidamente a infraestrutura necessária para os testes iniciais, garantindo maior padronização do ambiente e simplificando o processo de desenvolvimento.</w:t>
+      </w:r>
+    </w:p>
+    <w:p>
+      <w:pPr>
+        <w:rPr>
+          <w:rFonts w:ascii="Times New Roman" w:hAnsi="Times New Roman"/>
+        </w:rPr>
+      </w:pPr>
+      <w:r>
+        <w:t xml:space="preserve">O </w:t>
+      </w:r>
+      <w:proofErr w:type="gramStart"/>
+      <w:r>
+        <w:t>uso</w:t>
+      </w:r>
+      <w:proofErr w:type="gramEnd"/>
+      <w:r>
+        <w:t xml:space="preserve"> do Docker também nos permitiu explorar uma das principais características da plataforma n8n: sua capacidade de ser executada em diferentes ambientes computacionais. Essa abordagem permite que a mesma configuração usada </w:t>
+      </w:r>
+      <w:proofErr w:type="gramStart"/>
+      <w:r>
+        <w:t>durante</w:t>
+      </w:r>
+      <w:proofErr w:type="gramEnd"/>
+      <w:r>
+        <w:t xml:space="preserve"> o desenvolvimento seja reproduzida em ambientes de teste ou produção, reduzindo problemas de compatibilidade e facilitando a manutenção da soluçã</w:t>
+      </w:r>
+      <w:r>
+        <w:t xml:space="preserve">o ao longo de seu ciclo de vida. </w:t>
+      </w:r>
+      <w:r>
+        <w:t xml:space="preserve">Para realizar os testes de integração e validar o funcionamento dos endpoints desenvolvidos, foi utilizada a ferramenta Insomnia. </w:t>
+      </w:r>
+      <w:proofErr w:type="gramStart"/>
+      <w:r>
+        <w:t>A</w:t>
+      </w:r>
+      <w:proofErr w:type="gramEnd"/>
+      <w:r>
+        <w:t xml:space="preserve"> escolha dessa tecnologia ocorreu devido ao seu conjunto de recursos voltados para o desenvolvimento e teste de APIs, permitindo analisar de forma detalhada as respostas retornadas pelo sistema.</w:t>
+      </w:r>
+      <w:r>
+        <w:rPr>
+          <w:rFonts w:ascii="Times New Roman" w:hAnsi="Times New Roman"/>
+        </w:rPr>
+        <w:t xml:space="preserve"> </w:t>
+      </w:r>
+      <w:r>
+        <w:t>Entre suas principais funcionalidades, destacam-se o suporte aos diferentes métodos HTTP, como GET</w:t>
+      </w:r>
+      <w:r>
+        <w:t xml:space="preserve"> e </w:t>
+      </w:r>
+      <w:r>
+        <w:t xml:space="preserve">POST, além da possibilidade de configurar cabeçalhos, parâmetros e corpos de requisição de maneira intuitiva. A ferramenta também oferece mecanismos para organização e agrupamento de endpoints em coleções, facilitando o gerenciamento e a documentação das interfaces utilizadas </w:t>
+      </w:r>
+      <w:proofErr w:type="gramStart"/>
+      <w:r>
+        <w:t>durante</w:t>
+      </w:r>
+      <w:proofErr w:type="gramEnd"/>
+      <w:r>
+        <w:t xml:space="preserve"> o desenvolvimento.</w:t>
+      </w:r>
+      <w:r>
+        <w:rPr>
+          <w:rFonts w:ascii="Times New Roman" w:hAnsi="Times New Roman"/>
+        </w:rPr>
+        <w:t xml:space="preserve"> </w:t>
+      </w:r>
+      <w:r>
+        <w:t xml:space="preserve">Dessa forma, o Insomnia foi empregado para validar a comunicação entre os serviços integrados, verificar a consistência dos dados retornados pelas APIs e auxiliar </w:t>
+      </w:r>
+      <w:proofErr w:type="gramStart"/>
+      <w:r>
+        <w:t>na</w:t>
+      </w:r>
+      <w:proofErr w:type="gramEnd"/>
+      <w:r>
+        <w:t xml:space="preserve"> identificação de possíveis falhas durante o processo de desenvolvimento. A Figura 6 apresenta </w:t>
+      </w:r>
+      <w:proofErr w:type="gramStart"/>
+      <w:r>
+        <w:t>a</w:t>
+      </w:r>
+      <w:proofErr w:type="gramEnd"/>
+      <w:r>
+        <w:t xml:space="preserve"> interface da ferramenta utilizada nos testes realizados.</w:t>
+      </w:r>
+    </w:p>
+    <w:p/>
+    <w:p>
+      <w:pPr>
+        <w:pStyle w:val="Legenda"/>
+        <w:rPr>
+          <w:lang w:val="pt-BR"/>
+        </w:rPr>
+      </w:pPr>
+      <w:r>
+        <w:rPr>
+          <w:lang w:val="pt-BR"/>
+        </w:rPr>
+        <w:t xml:space="preserve">Figura </w:t>
+      </w:r>
+      <w:r>
+        <w:t>6</w:t>
+      </w:r>
+      <w:r>
+        <w:rPr>
+          <w:lang w:val="pt-BR"/>
+        </w:rPr>
+        <w:t xml:space="preserve"> </w:t>
+      </w:r>
+      <w:r>
+        <w:rPr>
+          <w:lang w:val="pt-BR"/>
+        </w:rPr>
+        <w:t>–</w:t>
+      </w:r>
+      <w:r>
+        <w:rPr>
+          <w:lang w:val="pt-BR"/>
+        </w:rPr>
+        <w:t xml:space="preserve"> </w:t>
+      </w:r>
+      <w:r>
+        <w:rPr>
+          <w:lang w:val="pt-BR"/>
+        </w:rPr>
+        <w:t>Interface do Insomnia</w:t>
+      </w:r>
+    </w:p>
+    <w:p>
+      <w:pPr>
+        <w:ind w:firstLine="0"/>
+        <w:jc w:val="center"/>
+        <w:rPr>
+          <w:lang w:val="pt-BR"/>
+        </w:rPr>
+      </w:pPr>
+      <w:r>
+        <w:rPr>
+          <w:noProof/>
+          <w:lang w:val="pt-BR" w:eastAsia="pt-BR"/>
+        </w:rPr>
+        <w:drawing>
+          <wp:inline distT="0" distB="0" distL="0" distR="0">
+            <wp:extent cx="5760720" cy="3081655"/>
+            <wp:effectExtent l="0" t="0" r="0" b="0"/>
+            <wp:docPr id="10" name="Imagem 10"/>
+            <wp:cNvGraphicFramePr>
+              <a:graphicFrameLocks xmlns:a="http://schemas.openxmlformats.org/drawingml/2006/main" noChangeAspect="1"/>
+            </wp:cNvGraphicFramePr>
+            <a:graphic xmlns:a="http://schemas.openxmlformats.org/drawingml/2006/main">
+              <a:graphicData uri="http://schemas.openxmlformats.org/drawingml/2006/picture">
+                <pic:pic xmlns:pic="http://schemas.openxmlformats.org/drawingml/2006/picture">
+                  <pic:nvPicPr>
+                    <pic:cNvPr id="10" name="Captura de tela 2026-05-29 235843.png"/>
+                    <pic:cNvPicPr/>
+                  </pic:nvPicPr>
+                  <pic:blipFill>
+                    <a:blip r:embed="rId16" cstate="print">
+                      <a:extLst>
+                        <a:ext uri="{28A0092B-C50C-407E-A947-70E740481C1C}">
+                          <a14:useLocalDpi xmlns:a14="http://schemas.microsoft.com/office/drawing/2010/main" val="0"/>
+                        </a:ext>
+                      </a:extLst>
+                    </a:blip>
+                    <a:stretch>
+                      <a:fillRect/>
+                    </a:stretch>
+                  </pic:blipFill>
+                  <pic:spPr>
+                    <a:xfrm>
+                      <a:off x="0" y="0"/>
+                      <a:ext cx="5760720" cy="3081655"/>
+                    </a:xfrm>
+                    <a:prstGeom prst="rect">
+                      <a:avLst/>
+                    </a:prstGeom>
+                  </pic:spPr>
+                </pic:pic>
+              </a:graphicData>
+            </a:graphic>
+          </wp:inline>
+        </w:drawing>
+      </w:r>
+      <w:r>
+        <w:rPr>
+          <w:lang w:val="pt-BR"/>
+        </w:rPr>
+        <w:br/>
+      </w:r>
+      <w:r>
+        <w:rPr>
+          <w:sz w:val="22"/>
+        </w:rPr>
+        <w:t>Fonte: Elaborada pelo autor, 2026</w:t>
+      </w:r>
+    </w:p>
+    <w:p>
+      <w:r>
+        <w:t xml:space="preserve">Para o desenvolvimento da interface responsável pela apresentação dos resultados, foi selecionada a ferramenta Vite. O Vite é um ambiente de construção para aplicações web modernas que combina um servidor de desenvolvimento de alto desempenho com um sistema de compilação otimizado. Desenvolvido por Evan You, o Vite destaca-se pela rápida inicialização de projetos e pelo recarregamento instantâneo das alterações realizadas </w:t>
+      </w:r>
+      <w:proofErr w:type="gramStart"/>
+      <w:r>
+        <w:t>durante</w:t>
+      </w:r>
+      <w:proofErr w:type="gramEnd"/>
+      <w:r>
+        <w:t xml:space="preserve"> o desenvolvimento, proporcionando maior produtividade e eficiênc</w:t>
+      </w:r>
+      <w:r>
+        <w:t xml:space="preserve">ia na construção de aplicações. </w:t>
+      </w:r>
+    </w:p>
+    <w:p>
+      <w:r>
+        <w:t xml:space="preserve">Após a definição das tecnologias de desenvolvimento, foram selecionadas as plataformas de hospedagem para o ambiente de produção. Para </w:t>
+      </w:r>
+      <w:proofErr w:type="gramStart"/>
+      <w:r>
+        <w:t>a</w:t>
+      </w:r>
+      <w:proofErr w:type="gramEnd"/>
+      <w:r>
+        <w:t xml:space="preserve"> execução dos fluxos de trabalho automatizados desenvolvidos em n8n, a Hostinger foi escolhida devido à sua praticidade, custo-benefício e disponibilidade de instâncias com n8n pré-configuradas, eliminando a necessidade de processos adicionais de instalação e configuração.</w:t>
+      </w:r>
+      <w:r>
+        <w:t xml:space="preserve"> </w:t>
+      </w:r>
+      <w:r>
+        <w:t>Para a hospedagem da aplicação frontend, a plataforma Vercel foi escolhida devido à sua integração simplificada com repositórios GitHub, facilidade de implantação contínua e compatibilidade com projetos desenvolvidos com o Vite. Além disso, a plataforma oferece recursos que facilitam a manutenção, atualização e escalabilidade da aplic</w:t>
+      </w:r>
+      <w:r>
+        <w:t>ação em um ambiente de produção.</w:t>
+      </w:r>
+    </w:p>
+    <w:p>
+      <w:pPr>
         <w:pStyle w:val="Ttulo2"/>
       </w:pPr>
       <w:r>
+        <w:lastRenderedPageBreak/>
         <w:t>Coleta e Integração dos Dados</w:t>
       </w:r>
     </w:p>
     <w:p>
+      <w:r>
+        <w:t xml:space="preserve">A fase de coleta e integração de dados visa disponibilizar informações do ambiente de e-commerce para processamento e análise automatizados. Para tanto, foram utilizadas APIs fornecidas pela plataforma VTEX, permitindo o acesso a dados relacionados a pedidos, vendas e outras informações operacionais do ambiente analisado. A VTEX é uma plataforma de e-commerce em nuvem que possibilita a criação, gestão e expansão de lojas virtuais e operações omnichannel. Fundada no Brasil em 2000, a empresa atende organizações de diversos portes em vários países, oferecendo uma infraestrutura escalável para </w:t>
+      </w:r>
+      <w:proofErr w:type="gramStart"/>
+      <w:r>
+        <w:t>vendas</w:t>
+      </w:r>
+      <w:proofErr w:type="gramEnd"/>
+      <w:r>
+        <w:t xml:space="preserve"> online e integração entre canais físicos e digitais. Esse tipo de informação é confidencial e só pode ser acessado com chaves de API que somente os clientes da plataforma podem gerar, mas, neste caso, as chaves de acesso fora</w:t>
+      </w:r>
+      <w:r>
+        <w:t>m fornecidas pela empresa N1.AG.</w:t>
+      </w:r>
+    </w:p>
+    <w:p>
+      <w:r>
+        <w:t xml:space="preserve">Os dados são obtidos por meio de requisições HTTP feitas pelo nó de Requisição HTTP do n8n, que utiliza os endpoints da plataforma e recupera as informações necessárias para </w:t>
+      </w:r>
+      <w:proofErr w:type="gramStart"/>
+      <w:r>
+        <w:t>a</w:t>
+      </w:r>
+      <w:proofErr w:type="gramEnd"/>
+      <w:r>
+        <w:t xml:space="preserve"> análise. Após a coleta, os dados passam por etapas de processamento e filtragem, eliminando informações sensíveis e padronizando </w:t>
+      </w:r>
+      <w:proofErr w:type="gramStart"/>
+      <w:r>
+        <w:t>a</w:t>
+      </w:r>
+      <w:proofErr w:type="gramEnd"/>
+      <w:r>
+        <w:t xml:space="preserve"> estrutura utilizada em todo o fluxo de trabalho. Em seguida, os dados processados ​​são enviados aos módulos responsáveis ​​pela análise e geração de insights, incluindo </w:t>
+      </w:r>
+      <w:proofErr w:type="gramStart"/>
+      <w:r>
+        <w:t>a</w:t>
+      </w:r>
+      <w:proofErr w:type="gramEnd"/>
+      <w:r>
+        <w:t xml:space="preserve"> integração com modelos de Inteligência Artificial. Essa abordagem automatiza a transformação de dados brutos em informações relevantes para apoiar a tomada de decisões, reduzindo a necessidade de processamento manual e aum</w:t>
+      </w:r>
+      <w:r>
+        <w:t xml:space="preserve">entando </w:t>
+      </w:r>
+      <w:proofErr w:type="gramStart"/>
+      <w:r>
+        <w:t>a</w:t>
+      </w:r>
+      <w:proofErr w:type="gramEnd"/>
+      <w:r>
+        <w:t xml:space="preserve"> eficiência da análise</w:t>
+      </w:r>
+      <w:r>
+        <w:t>.</w:t>
+      </w:r>
+    </w:p>
+    <w:p>
       <w:pPr>
         <w:pStyle w:val="Ttulo2"/>
       </w:pPr>
@@ -5316,7 +5774,238 @@
         <w:t>Desenvolvimento do Fluxo Automatizado</w:t>
       </w:r>
     </w:p>
-    <w:bookmarkEnd w:id="9"/>
+    <w:p>
+      <w:pPr>
+        <w:rPr>
+          <w:lang w:val="pt-BR"/>
+        </w:rPr>
+      </w:pPr>
+      <w:r>
+        <w:rPr>
+          <w:lang w:val="pt-BR"/>
+        </w:rPr>
+        <w:t xml:space="preserve">Após a definição das tecnologias e mecanismos de coleta de dados, foi desenvolvido o MVP (Produto Mínimo Viável) do fluxo de trabalho automatizado responsável pela integração dos serviços utilizados neste trabalho. Com o Docker devidamente instalado e configurado com a imagem n8nio/n8n, foi realizada uma análise do ambiente n8n para determinar os nós que poderiam atender às necessidades do fluxo de trabalho. Do amplo conjunto de nós, foram selecionados: o nó Webhook, para conectar o front-end ao fluxo; ele permite a proteção do sistema utilizando métodos de autenticação JWT e limitação de resposta. Em seguida, foi selecionado o nó HTTP Request; este permite o acesso aos dados de vendas da </w:t>
+      </w:r>
+      <w:r>
+        <w:rPr>
+          <w:lang w:val="pt-BR"/>
+        </w:rPr>
+        <w:lastRenderedPageBreak/>
+        <w:t>VTEX, bem como a adição de chaves de API. Além disso, foi adicionado o nó Code para aplicar código com o objetivo de filtrar e manipular os dados; existem outros blocos para realizar essa extração, como o Filter, mas o nó Code permite alterar as regras e t</w:t>
+      </w:r>
+      <w:r>
+        <w:rPr>
+          <w:lang w:val="pt-BR"/>
+        </w:rPr>
+        <w:t>orná-lo mais flexível à demanda.</w:t>
+      </w:r>
+    </w:p>
+    <w:p>
+      <w:pPr>
+        <w:rPr>
+          <w:lang w:val="pt-BR"/>
+        </w:rPr>
+      </w:pPr>
+      <w:r>
+        <w:rPr>
+          <w:lang w:val="pt-BR"/>
+        </w:rPr>
+        <w:t>Para conectar o fluxo ao modelo Gemini 2.5-flash, foi selecionado o nó AI Agent. Este nó suporta diferentes modelos de mercado existentes, como GPT e Claude, e também permite adicionar memória para persistir o contexto das mensagens dos modelos. Ele também permite adicionar ferramentas para conferir mais funcionalidades aos modelos adicion</w:t>
+      </w:r>
+      <w:r>
+        <w:rPr>
+          <w:lang w:val="pt-BR"/>
+        </w:rPr>
+        <w:t>ados, como mostrado na Figura 4</w:t>
+      </w:r>
+      <w:r>
+        <w:rPr>
+          <w:lang w:val="pt-BR"/>
+        </w:rPr>
+        <w:t>, além de adicionar acionadores específicos</w:t>
+      </w:r>
+      <w:r>
+        <w:rPr>
+          <w:lang w:val="pt-BR"/>
+        </w:rPr>
+        <w:t>.</w:t>
+      </w:r>
+      <w:r>
+        <w:rPr>
+          <w:lang w:val="pt-BR"/>
+        </w:rPr>
+        <w:t xml:space="preserve"> </w:t>
+      </w:r>
+      <w:r>
+        <w:rPr>
+          <w:lang w:val="pt-BR"/>
+        </w:rPr>
+        <w:t xml:space="preserve">Juntamente com a seleção do nó Agente de IA, foi desenvolvido um agente para analisar os dados e entregar os resultados esperados. Seu desenvolvimento foi guiado pelo CTO da N1.AG, Rafael Augusto da Silva Bispo. O agente ocupa a posição de Estrategista de Cadeia de Suprimentos e Growth Hacker, especializado em e-commerce. Um de seus principais focos é a análise de dados com base na curva ABC, análise de Pareto (80/20), gestão de estoque e riscos operacionais. Além de definir o papel e as principais estratégias de análise, outro </w:t>
+      </w:r>
+      <w:r>
+        <w:rPr>
+          <w:lang w:val="pt-BR"/>
+        </w:rPr>
+        <w:t>ponto importante é enfatizar a</w:t>
+      </w:r>
+      <w:r>
+        <w:rPr>
+          <w:lang w:val="pt-BR"/>
+        </w:rPr>
+        <w:t xml:space="preserve"> missão</w:t>
+      </w:r>
+      <w:r>
+        <w:rPr>
+          <w:lang w:val="pt-BR"/>
+        </w:rPr>
+        <w:t xml:space="preserve"> do agente</w:t>
+      </w:r>
+      <w:r>
+        <w:rPr>
+          <w:lang w:val="pt-BR"/>
+        </w:rPr>
+        <w:t xml:space="preserve">: analisar dados de vendas, identificar riscos ocultos, dependências de receita perigosas e oportunidades claras de venda cruzada, </w:t>
+      </w:r>
+      <w:r>
+        <w:rPr>
+          <w:lang w:val="pt-BR"/>
+        </w:rPr>
+        <w:t xml:space="preserve">dando ênfase que deve </w:t>
+      </w:r>
+      <w:r>
+        <w:rPr>
+          <w:lang w:val="pt-BR"/>
+        </w:rPr>
+        <w:t>retor</w:t>
+      </w:r>
+      <w:r>
+        <w:rPr>
+          <w:lang w:val="pt-BR"/>
+        </w:rPr>
+        <w:t>nar no formato JSON para facilitar o segundo processo de filtragem</w:t>
+      </w:r>
+      <w:r>
+        <w:rPr>
+          <w:szCs w:val="24"/>
+        </w:rPr>
+        <w:t>.</w:t>
+      </w:r>
+      <w:r>
+        <w:rPr>
+          <w:szCs w:val="24"/>
+        </w:rPr>
+        <w:t xml:space="preserve"> </w:t>
+      </w:r>
+      <w:r>
+        <w:rPr>
+          <w:szCs w:val="24"/>
+        </w:rPr>
+        <w:t>Com as principais características do agente estabelecidas, o próximo passo foi</w:t>
+      </w:r>
+      <w:r>
+        <w:rPr>
+          <w:szCs w:val="24"/>
+        </w:rPr>
+        <w:t xml:space="preserve"> explicação</w:t>
+      </w:r>
+      <w:r>
+        <w:rPr>
+          <w:szCs w:val="24"/>
+        </w:rPr>
+        <w:t xml:space="preserve"> </w:t>
+      </w:r>
+      <w:r>
+        <w:rPr>
+          <w:szCs w:val="24"/>
+        </w:rPr>
+        <w:t>d</w:t>
+      </w:r>
+      <w:r>
+        <w:rPr>
+          <w:szCs w:val="24"/>
+        </w:rPr>
+        <w:t xml:space="preserve">os dados que ele recebe, </w:t>
+      </w:r>
+      <w:proofErr w:type="gramStart"/>
+      <w:r>
+        <w:rPr>
+          <w:szCs w:val="24"/>
+        </w:rPr>
+        <w:t>sua</w:t>
+      </w:r>
+      <w:proofErr w:type="gramEnd"/>
+      <w:r>
+        <w:rPr>
+          <w:szCs w:val="24"/>
+        </w:rPr>
+        <w:t xml:space="preserve"> identificação e as características de cada um, para que o agente possa se orie</w:t>
+      </w:r>
+      <w:r>
+        <w:rPr>
+          <w:szCs w:val="24"/>
+        </w:rPr>
+        <w:t xml:space="preserve">ntar sem o risco de alucinações. </w:t>
+      </w:r>
+      <w:r>
+        <w:rPr>
+          <w:lang w:val="pt-BR"/>
+        </w:rPr>
+        <w:t>Outro ponto importante para evitar um grande número de alucinações foi a adição de uma seção que reforçasse o objetivo da análise e como o agente deveria se "comportar", com o perfil de um consulto</w:t>
+      </w:r>
+      <w:r>
+        <w:rPr>
+          <w:lang w:val="pt-BR"/>
+        </w:rPr>
+        <w:t xml:space="preserve">r estratégico para um varejista. </w:t>
+      </w:r>
+    </w:p>
+    <w:p>
+      <w:pPr>
+        <w:rPr>
+          <w:szCs w:val="24"/>
+        </w:rPr>
+      </w:pPr>
+      <w:r>
+        <w:rPr>
+          <w:szCs w:val="24"/>
+        </w:rPr>
+        <w:t>Dois nós foram selecionados para executar o processo de envio da resposta do agente</w:t>
+      </w:r>
+      <w:r>
+        <w:rPr>
+          <w:szCs w:val="24"/>
+        </w:rPr>
+        <w:t>, Response to Webhook e Send Mail</w:t>
+      </w:r>
+      <w:r>
+        <w:rPr>
+          <w:szCs w:val="24"/>
+        </w:rPr>
+        <w:t xml:space="preserve">. O n8n oferece diferentes maneiras de enviar e-mails, como Gmail e Microsoft Outlook, mas esses métodos exigem autorizações pagas. Visando uma solução mais econômica, simples e rápida, o nó Send Mail, juntamente com a plataforma Mailtrap, atende à necessidade desse método de envio de dados. O nó permite uma configuração rápida e fácil com qualquer provedor e, combinado com a simplicidade de acesso aos e-mails enviados </w:t>
+      </w:r>
+      <w:r>
+        <w:rPr>
+          <w:szCs w:val="24"/>
+        </w:rPr>
+        <w:lastRenderedPageBreak/>
+        <w:t>e o gerenciamento completo (já que o Mailtrap é gratuito), representa a maneira mais prática de executar essa tarefa.</w:t>
+      </w:r>
+      <w:r>
+        <w:rPr>
+          <w:szCs w:val="24"/>
+        </w:rPr>
+        <w:t xml:space="preserve"> </w:t>
+      </w:r>
+      <w:r>
+        <w:rPr>
+          <w:szCs w:val="24"/>
+        </w:rPr>
+        <w:t>A resposta ao webhook conecta-se ao nó inicial do fluxo para enviar a resposta a quem fez a solicitação ao sistema.</w:t>
+      </w:r>
+      <w:bookmarkStart w:id="9" w:name="_GoBack"/>
+      <w:bookmarkEnd w:id="9"/>
+    </w:p>
+    <w:bookmarkEnd w:id="8"/>
     <w:p>
       <w:pPr>
         <w:pStyle w:val="Ttulo1"/>
@@ -5327,6 +6016,13 @@
     </w:p>
     <w:p>
       <w:pPr>
+        <w:rPr>
+          <w:lang w:val="pt-BR"/>
+        </w:rPr>
+      </w:pPr>
+    </w:p>
+    <w:p>
+      <w:pPr>
         <w:pStyle w:val="Ttulo1"/>
       </w:pPr>
       <w:bookmarkStart w:id="10" w:name="_Toc365129136"/>
@@ -5336,6 +6032,13 @@
     </w:p>
     <w:p>
       <w:pPr>
+        <w:rPr>
+          <w:lang w:val="pt-BR"/>
+        </w:rPr>
+      </w:pPr>
+    </w:p>
+    <w:p>
+      <w:pPr>
         <w:pStyle w:val="Ttulo1"/>
       </w:pPr>
       <w:r>
@@ -5344,6 +6047,13 @@
     </w:p>
     <w:p>
       <w:pPr>
+        <w:rPr>
+          <w:lang w:val="pt-BR"/>
+        </w:rPr>
+      </w:pPr>
+    </w:p>
+    <w:p>
+      <w:pPr>
         <w:pStyle w:val="Ttulo1"/>
       </w:pPr>
       <w:r>
@@ -5356,1277 +6066,17 @@
           <w:lang w:val="pt-BR"/>
         </w:rPr>
       </w:pPr>
-      <w:r>
-        <w:rPr>
-          <w:lang w:val="pt-BR"/>
-        </w:rPr>
-        <w:t xml:space="preserve">As citações devem ser apresentadas conforme </w:t>
-      </w:r>
-      <w:r>
-        <w:rPr>
-          <w:lang w:val="pt-BR"/>
-        </w:rPr>
-        <w:t>a NBR 10520</w:t>
-      </w:r>
-      <w:r>
-        <w:rPr>
-          <w:lang w:val="pt-BR"/>
-        </w:rPr>
-        <w:t xml:space="preserve">. </w:t>
-      </w:r>
-      <w:r>
-        <w:rPr>
-          <w:lang w:val="pt-BR"/>
-        </w:rPr>
-        <w:t xml:space="preserve">Alguns exemplos </w:t>
-      </w:r>
-      <w:r>
-        <w:rPr>
-          <w:lang w:val="pt-BR"/>
-        </w:rPr>
-        <w:t xml:space="preserve">foram </w:t>
-      </w:r>
-      <w:r>
-        <w:rPr>
-          <w:lang w:val="pt-BR"/>
-        </w:rPr>
-        <w:t>extraídos da referida norma são apresentados a seguir:</w:t>
-      </w:r>
-    </w:p>
-    <w:p>
-      <w:pPr>
-        <w:rPr>
-          <w:lang w:val="pt-BR"/>
-        </w:rPr>
-      </w:pPr>
-      <w:r>
-        <w:rPr>
-          <w:lang w:val="pt-BR"/>
-        </w:rPr>
-        <w:t>A produção de lítio começa em 1928 (MUMFORD, 1949).</w:t>
-      </w:r>
-    </w:p>
-    <w:p>
-      <w:pPr>
-        <w:rPr>
-          <w:lang w:val="pt-BR"/>
-        </w:rPr>
-      </w:pPr>
-      <w:r>
-        <w:rPr>
-          <w:lang w:val="pt-BR"/>
-        </w:rPr>
-        <w:t>Oliveira e Leonardo</w:t>
-      </w:r>
-      <w:r>
-        <w:rPr>
-          <w:lang w:val="pt-BR"/>
-        </w:rPr>
-        <w:t xml:space="preserve"> (1943) </w:t>
-      </w:r>
-      <w:r>
-        <w:rPr>
-          <w:lang w:val="pt-BR"/>
-        </w:rPr>
-        <w:t xml:space="preserve">afirmam </w:t>
-      </w:r>
-      <w:r>
-        <w:rPr>
-          <w:lang w:val="pt-BR"/>
-        </w:rPr>
-        <w:t>que</w:t>
-      </w:r>
-      <w:r>
-        <w:rPr>
-          <w:lang w:val="pt-BR"/>
-        </w:rPr>
-        <w:t xml:space="preserve"> ...</w:t>
-      </w:r>
-    </w:p>
-    <w:p>
-      <w:pPr>
-        <w:rPr>
-          <w:lang w:val="pt-BR"/>
-        </w:rPr>
-      </w:pPr>
-      <w:r>
-        <w:rPr>
-          <w:lang w:val="pt-BR"/>
-        </w:rPr>
-        <w:t>Quando existirem mais de três autores, indica-se apenas o primeiro</w:t>
-      </w:r>
-      <w:r>
-        <w:rPr>
-          <w:lang w:val="pt-BR"/>
-        </w:rPr>
-        <w:t xml:space="preserve"> autor</w:t>
-      </w:r>
-      <w:r>
-        <w:rPr>
-          <w:lang w:val="pt-BR"/>
-        </w:rPr>
-        <w:t xml:space="preserve">, acrescentando-se a expressão </w:t>
-      </w:r>
-      <w:r>
-        <w:rPr>
-          <w:b/>
-          <w:lang w:val="pt-BR"/>
-        </w:rPr>
-        <w:t>et al.</w:t>
-      </w:r>
-    </w:p>
-    <w:p>
-      <w:pPr>
-        <w:rPr>
-          <w:lang w:val="pt-BR"/>
-        </w:rPr>
-      </w:pPr>
-      <w:r>
-        <w:rPr>
-          <w:lang w:val="pt-BR"/>
-        </w:rPr>
-        <w:t>Silva et al. (2005) determinou a equação de ajuste...</w:t>
-      </w:r>
-    </w:p>
-    <w:p>
-      <w:pPr>
-        <w:rPr>
-          <w:lang w:val="pt-BR"/>
-        </w:rPr>
-      </w:pPr>
-      <w:r>
-        <w:rPr>
-          <w:lang w:val="pt-BR"/>
-        </w:rPr>
-        <w:t>... a equação de ajuste foi determinada (Silva et al., 2005)</w:t>
-      </w:r>
-    </w:p>
-    <w:p>
-      <w:pPr>
-        <w:rPr>
-          <w:lang w:val="pt-BR"/>
-        </w:rPr>
-      </w:pPr>
-      <w:r>
-        <w:rPr>
-          <w:lang w:val="pt-BR"/>
-        </w:rPr>
-        <w:t xml:space="preserve">Detalhes adicionais sobre a citação de obras, </w:t>
-      </w:r>
-      <w:proofErr w:type="gramStart"/>
-      <w:r>
-        <w:rPr>
-          <w:lang w:val="pt-BR"/>
-        </w:rPr>
-        <w:t>o(</w:t>
-      </w:r>
-      <w:proofErr w:type="gramEnd"/>
-      <w:r>
-        <w:rPr>
-          <w:lang w:val="pt-BR"/>
-        </w:rPr>
-        <w:t>a) candidato(a) deve consultar a norma mencionada</w:t>
-      </w:r>
-      <w:r>
-        <w:rPr>
-          <w:lang w:val="pt-BR"/>
-        </w:rPr>
-        <w:t>NBR 10520</w:t>
-      </w:r>
-      <w:r>
-        <w:rPr>
-          <w:lang w:val="pt-BR"/>
-        </w:rPr>
-        <w:t>.</w:t>
-      </w:r>
-    </w:p>
-    <w:p>
-      <w:pPr>
-        <w:pStyle w:val="Ttulo2"/>
-      </w:pPr>
-      <w:bookmarkStart w:id="11" w:name="_Toc365129134"/>
-      <w:r>
-        <w:t>Exemplo de figura, de tabela e de equação</w:t>
+    </w:p>
+    <w:p>
+      <w:pPr>
+        <w:pStyle w:val="Ttulo1"/>
+      </w:pPr>
+      <w:bookmarkStart w:id="11" w:name="_Toc365129138"/>
+      <w:bookmarkEnd w:id="10"/>
+      <w:r>
+        <w:t>Referências</w:t>
       </w:r>
       <w:bookmarkEnd w:id="11"/>
-    </w:p>
-    <w:p>
-      <w:pPr>
-        <w:rPr>
-          <w:lang w:val="pt-BR"/>
-        </w:rPr>
-      </w:pPr>
-      <w:r>
-        <w:rPr>
-          <w:lang w:val="pt-BR"/>
-        </w:rPr>
-        <w:t xml:space="preserve">A </w:t>
-      </w:r>
-      <w:r>
-        <w:rPr>
-          <w:lang w:val="pt-BR"/>
-        </w:rPr>
-        <w:fldChar w:fldCharType="begin"/>
-      </w:r>
-      <w:r>
-        <w:rPr>
-          <w:lang w:val="pt-BR"/>
-        </w:rPr>
-        <w:instrText xml:space="preserve"> REF  _Ref365128594 \* Lower \h </w:instrText>
-      </w:r>
-      <w:r>
-        <w:rPr>
-          <w:lang w:val="pt-BR"/>
-        </w:rPr>
-      </w:r>
-      <w:r>
-        <w:rPr>
-          <w:lang w:val="pt-BR"/>
-        </w:rPr>
-        <w:fldChar w:fldCharType="separate"/>
-      </w:r>
-      <w:r>
-        <w:rPr>
-          <w:lang w:val="pt-BR"/>
-        </w:rPr>
-        <w:t xml:space="preserve">figura </w:t>
-      </w:r>
-      <w:r>
-        <w:rPr>
-          <w:noProof/>
-          <w:lang w:val="pt-BR"/>
-        </w:rPr>
-        <w:t>1</w:t>
-      </w:r>
-      <w:r>
-        <w:rPr>
-          <w:lang w:val="pt-BR"/>
-        </w:rPr>
-        <w:fldChar w:fldCharType="end"/>
-      </w:r>
-      <w:r>
-        <w:rPr>
-          <w:lang w:val="pt-BR"/>
-        </w:rPr>
-        <w:fldChar w:fldCharType="begin"/>
-      </w:r>
-      <w:r>
-        <w:rPr>
-          <w:lang w:val="pt-BR"/>
-        </w:rPr>
-        <w:instrText xml:space="preserve"> REF  _Ref348782144 \* Lower \h </w:instrText>
-      </w:r>
-      <w:r>
-        <w:rPr>
-          <w:lang w:val="pt-BR"/>
-        </w:rPr>
-      </w:r>
-      <w:r>
-        <w:rPr>
-          <w:lang w:val="pt-BR"/>
-        </w:rPr>
-        <w:fldChar w:fldCharType="end"/>
-      </w:r>
-      <w:r>
-        <w:rPr>
-          <w:lang w:val="pt-BR"/>
-        </w:rPr>
-        <w:t>mostra a trajetória paralela à curva por interpolação utilizada.</w:t>
-      </w:r>
-    </w:p>
-    <w:p>
-      <w:pPr>
-        <w:pStyle w:val="Legenda"/>
-        <w:rPr>
-          <w:lang w:val="pt-BR"/>
-        </w:rPr>
-      </w:pPr>
-      <w:bookmarkStart w:id="12" w:name="_Ref365128594"/>
-      <w:bookmarkStart w:id="13" w:name="_Toc365129144"/>
-      <w:r>
-        <w:rPr>
-          <w:lang w:val="pt-BR"/>
-        </w:rPr>
-        <w:t xml:space="preserve">Figura </w:t>
-      </w:r>
-      <w:r>
-        <w:fldChar w:fldCharType="begin"/>
-      </w:r>
-      <w:r>
-        <w:rPr>
-          <w:lang w:val="pt-BR"/>
-        </w:rPr>
-        <w:instrText xml:space="preserve"> SEQ Figura \* ARABIC </w:instrText>
-      </w:r>
-      <w:r>
-        <w:fldChar w:fldCharType="separate"/>
-      </w:r>
-      <w:r>
-        <w:rPr>
-          <w:noProof/>
-          <w:lang w:val="pt-BR"/>
-        </w:rPr>
-        <w:t>1</w:t>
-      </w:r>
-      <w:r>
-        <w:fldChar w:fldCharType="end"/>
-      </w:r>
-      <w:bookmarkEnd w:id="12"/>
-      <w:r>
-        <w:rPr>
-          <w:lang w:val="pt-BR"/>
-        </w:rPr>
-        <w:t xml:space="preserve"> - </w:t>
-      </w:r>
-      <w:r>
-        <w:rPr>
-          <w:lang w:val="pt-BR"/>
-        </w:rPr>
-        <w:t>Trajetória paralela à curva por interpolação</w:t>
-      </w:r>
-      <w:bookmarkEnd w:id="13"/>
-    </w:p>
-    <w:p>
-      <w:pPr>
-        <w:pStyle w:val="Legenda"/>
-        <w:rPr>
-          <w:lang w:val="pt-BR"/>
-        </w:rPr>
-      </w:pPr>
-      <w:bookmarkStart w:id="14" w:name="_Ref308343327"/>
-      <w:bookmarkStart w:id="15" w:name="_Ref348782144"/>
-      <w:r>
-        <w:rPr>
-          <w:noProof/>
-        </w:rPr>
-        <w:lastRenderedPageBreak/>
-        <w:pict>
-          <v:shapetype id="_x0000_t202" coordsize="21600,21600" o:spt="202" path="m,l,21600r21600,l21600,xe">
-            <v:stroke joinstyle="miter"/>
-            <v:path gradientshapeok="t" o:connecttype="rect"/>
-          </v:shapetype>
-          <v:shape id="_x0000_s1028" type="#_x0000_t202" style="position:absolute;left:0;text-align:left;margin-left:10.55pt;margin-top:2.25pt;width:442.45pt;height:278.85pt;z-index:251659264">
-            <v:textbox style="mso-next-textbox:#_x0000_s1028">
-              <w:txbxContent>
-                <w:p>
-                  <w:pPr>
-                    <w:ind w:firstLine="0"/>
-                  </w:pPr>
-                  <w:r>
-                    <w:rPr>
-                      <w:noProof/>
-                      <w:lang w:val="pt-BR" w:eastAsia="pt-BR"/>
-                    </w:rPr>
-                    <w:drawing>
-                      <wp:inline distT="0" distB="0" distL="0" distR="0" wp14:anchorId="01AEDB8F" wp14:editId="2C29B7B2">
-                        <wp:extent cx="5356978" cy="3391152"/>
-                        <wp:effectExtent l="0" t="0" r="0" b="0"/>
-                        <wp:docPr id="9" name="Imagem 1" descr="figura_1.GIF"/>
-                        <wp:cNvGraphicFramePr>
-                          <a:graphicFrameLocks xmlns:a="http://schemas.openxmlformats.org/drawingml/2006/main" noChangeAspect="1"/>
-                        </wp:cNvGraphicFramePr>
-                        <a:graphic xmlns:a="http://schemas.openxmlformats.org/drawingml/2006/main">
-                          <a:graphicData uri="http://schemas.openxmlformats.org/drawingml/2006/picture">
-                            <pic:pic xmlns:pic="http://schemas.openxmlformats.org/drawingml/2006/picture">
-                              <pic:nvPicPr>
-                                <pic:cNvPr id="0" name="figura_1.GIF"/>
-                                <pic:cNvPicPr/>
-                              </pic:nvPicPr>
-                              <pic:blipFill>
-                                <a:blip r:embed="rId16"/>
-                                <a:stretch>
-                                  <a:fillRect/>
-                                </a:stretch>
-                              </pic:blipFill>
-                              <pic:spPr>
-                                <a:xfrm>
-                                  <a:off x="0" y="0"/>
-                                  <a:ext cx="5400977" cy="3419005"/>
-                                </a:xfrm>
-                                <a:prstGeom prst="rect">
-                                  <a:avLst/>
-                                </a:prstGeom>
-                              </pic:spPr>
-                            </pic:pic>
-                          </a:graphicData>
-                        </a:graphic>
-                      </wp:inline>
-                    </w:drawing>
-                  </w:r>
-                </w:p>
-              </w:txbxContent>
-            </v:textbox>
-            <w10:wrap type="topAndBottom"/>
-            <w10:anchorlock/>
-          </v:shape>
-        </w:pict>
-      </w:r>
-      <w:bookmarkEnd w:id="14"/>
-      <w:bookmarkEnd w:id="15"/>
-      <w:r>
-        <w:rPr>
-          <w:lang w:val="pt-BR"/>
-        </w:rPr>
-        <w:t>Fonte: Elaborada pelo autor</w:t>
-      </w:r>
-    </w:p>
-    <w:p>
-      <w:pPr>
-        <w:rPr>
-          <w:lang w:val="pt-BR"/>
-        </w:rPr>
-      </w:pPr>
-      <w:r>
-        <w:rPr>
-          <w:lang w:val="pt-BR"/>
-        </w:rPr>
-        <w:t>De acordo com a</w:t>
-      </w:r>
-      <w:r>
-        <w:rPr>
-          <w:lang w:val="pt-BR"/>
-        </w:rPr>
-        <w:fldChar w:fldCharType="begin"/>
-      </w:r>
-      <w:r>
-        <w:rPr>
-          <w:lang w:val="pt-BR"/>
-        </w:rPr>
-        <w:instrText xml:space="preserve"> REF  _Ref365128594 \* Lower \h </w:instrText>
-      </w:r>
-      <w:r>
-        <w:rPr>
-          <w:lang w:val="pt-BR"/>
-        </w:rPr>
-      </w:r>
-      <w:r>
-        <w:rPr>
-          <w:lang w:val="pt-BR"/>
-        </w:rPr>
-        <w:fldChar w:fldCharType="separate"/>
-      </w:r>
-      <w:r>
-        <w:rPr>
-          <w:lang w:val="pt-BR"/>
-        </w:rPr>
-        <w:t xml:space="preserve">figura </w:t>
-      </w:r>
-      <w:r>
-        <w:rPr>
-          <w:noProof/>
-          <w:lang w:val="pt-BR"/>
-        </w:rPr>
-        <w:t>1</w:t>
-      </w:r>
-      <w:r>
-        <w:rPr>
-          <w:lang w:val="pt-BR"/>
-        </w:rPr>
-        <w:fldChar w:fldCharType="end"/>
-      </w:r>
-      <w:r>
-        <w:rPr>
-          <w:lang w:val="pt-BR"/>
-        </w:rPr>
-        <w:fldChar w:fldCharType="begin"/>
-      </w:r>
-      <w:r>
-        <w:rPr>
-          <w:lang w:val="pt-BR"/>
-        </w:rPr>
-        <w:instrText xml:space="preserve"> REF  _Ref348782144 \* Lower \h </w:instrText>
-      </w:r>
-      <w:r>
-        <w:rPr>
-          <w:lang w:val="pt-BR"/>
-        </w:rPr>
-      </w:r>
-      <w:r>
-        <w:rPr>
-          <w:lang w:val="pt-BR"/>
-        </w:rPr>
-        <w:fldChar w:fldCharType="end"/>
-      </w:r>
-      <w:r>
-        <w:rPr>
-          <w:lang w:val="pt-BR"/>
-        </w:rPr>
-        <w:t>, ...</w:t>
-      </w:r>
-    </w:p>
-    <w:p>
-      <w:pPr>
-        <w:rPr>
-          <w:lang w:val="pt-BR"/>
-        </w:rPr>
-      </w:pPr>
-    </w:p>
-    <w:p>
-      <w:pPr>
-        <w:rPr>
-          <w:lang w:val="pt-BR"/>
-        </w:rPr>
-      </w:pPr>
-      <w:r>
-        <w:rPr>
-          <w:lang w:val="pt-BR"/>
-        </w:rPr>
-        <w:t>A tabela 1 evidencia os dados...</w:t>
-      </w:r>
-    </w:p>
-    <w:p>
-      <w:pPr>
-        <w:pStyle w:val="Legenda"/>
-        <w:rPr>
-          <w:lang w:val="pt-BR"/>
-        </w:rPr>
-      </w:pPr>
-      <w:bookmarkStart w:id="16" w:name="_Toc365137099"/>
-      <w:r>
-        <w:rPr>
-          <w:lang w:val="pt-BR"/>
-        </w:rPr>
-        <w:t xml:space="preserve">Tabela </w:t>
-      </w:r>
-      <w:r>
-        <w:fldChar w:fldCharType="begin"/>
-      </w:r>
-      <w:r>
-        <w:rPr>
-          <w:lang w:val="pt-BR"/>
-        </w:rPr>
-        <w:instrText xml:space="preserve"> SEQ Tabela \* ARABIC </w:instrText>
-      </w:r>
-      <w:r>
-        <w:fldChar w:fldCharType="separate"/>
-      </w:r>
-      <w:r>
-        <w:rPr>
-          <w:noProof/>
-          <w:lang w:val="pt-BR"/>
-        </w:rPr>
-        <w:t>1</w:t>
-      </w:r>
-      <w:r>
-        <w:fldChar w:fldCharType="end"/>
-      </w:r>
-      <w:r>
-        <w:rPr>
-          <w:noProof/>
-          <w:lang w:val="pt-BR"/>
-        </w:rPr>
-        <w:t xml:space="preserve"> - Distância no intervalo d</w:t>
-      </w:r>
-      <w:r>
-        <w:rPr>
-          <w:noProof/>
-          <w:lang w:val="pt-BR"/>
-        </w:rPr>
-        <w:t>e tempo entre 4 e 5 segundos</w:t>
-      </w:r>
-      <w:bookmarkEnd w:id="16"/>
-    </w:p>
-    <w:tbl>
-      <w:tblPr>
-        <w:tblStyle w:val="Tabelacomgrade"/>
-        <w:tblW w:w="0" w:type="auto"/>
-        <w:tblInd w:w="817" w:type="dxa"/>
-        <w:tblLook w:val="04A0" w:firstRow="1" w:lastRow="0" w:firstColumn="1" w:lastColumn="0" w:noHBand="0" w:noVBand="1"/>
-      </w:tblPr>
-      <w:tblGrid>
-        <w:gridCol w:w="2552"/>
-        <w:gridCol w:w="941"/>
-        <w:gridCol w:w="941"/>
-        <w:gridCol w:w="941"/>
-        <w:gridCol w:w="901"/>
-        <w:gridCol w:w="902"/>
-        <w:gridCol w:w="902"/>
-      </w:tblGrid>
-      <w:tr>
-        <w:tc>
-          <w:tcPr>
-            <w:tcW w:w="2552" w:type="dxa"/>
-            <w:vAlign w:val="center"/>
-          </w:tcPr>
-          <w:p>
-            <w:pPr>
-              <w:ind w:firstLine="0"/>
-              <w:jc w:val="center"/>
-              <w:rPr>
-                <w:lang w:val="pt-BR"/>
-              </w:rPr>
-            </w:pPr>
-            <w:r>
-              <w:rPr>
-                <w:lang w:val="pt-BR"/>
-              </w:rPr>
-              <w:t>Intervalo de tempo (s)</w:t>
-            </w:r>
-          </w:p>
-        </w:tc>
-        <w:tc>
-          <w:tcPr>
-            <w:tcW w:w="941" w:type="dxa"/>
-            <w:vAlign w:val="center"/>
-          </w:tcPr>
-          <w:p>
-            <w:pPr>
-              <w:ind w:firstLine="0"/>
-              <w:jc w:val="center"/>
-              <w:rPr>
-                <w:lang w:val="pt-BR"/>
-              </w:rPr>
-            </w:pPr>
-            <w:r>
-              <w:rPr>
-                <w:lang w:val="pt-BR"/>
-              </w:rPr>
-              <w:t>4,0</w:t>
-            </w:r>
-          </w:p>
-        </w:tc>
-        <w:tc>
-          <w:tcPr>
-            <w:tcW w:w="941" w:type="dxa"/>
-            <w:vAlign w:val="center"/>
-          </w:tcPr>
-          <w:p>
-            <w:pPr>
-              <w:ind w:firstLine="0"/>
-              <w:jc w:val="center"/>
-              <w:rPr>
-                <w:lang w:val="pt-BR"/>
-              </w:rPr>
-            </w:pPr>
-            <w:r>
-              <w:rPr>
-                <w:lang w:val="pt-BR"/>
-              </w:rPr>
-              <w:t>4,2</w:t>
-            </w:r>
-          </w:p>
-        </w:tc>
-        <w:tc>
-          <w:tcPr>
-            <w:tcW w:w="941" w:type="dxa"/>
-            <w:vAlign w:val="center"/>
-          </w:tcPr>
-          <w:p>
-            <w:pPr>
-              <w:ind w:firstLine="0"/>
-              <w:jc w:val="center"/>
-              <w:rPr>
-                <w:lang w:val="pt-BR"/>
-              </w:rPr>
-            </w:pPr>
-            <w:r>
-              <w:rPr>
-                <w:lang w:val="pt-BR"/>
-              </w:rPr>
-              <w:t>4,4</w:t>
-            </w:r>
-          </w:p>
-        </w:tc>
-        <w:tc>
-          <w:tcPr>
-            <w:tcW w:w="901" w:type="dxa"/>
-            <w:vAlign w:val="center"/>
-          </w:tcPr>
-          <w:p>
-            <w:pPr>
-              <w:ind w:firstLine="0"/>
-              <w:jc w:val="center"/>
-              <w:rPr>
-                <w:lang w:val="pt-BR"/>
-              </w:rPr>
-            </w:pPr>
-            <w:r>
-              <w:rPr>
-                <w:lang w:val="pt-BR"/>
-              </w:rPr>
-              <w:t>4,6</w:t>
-            </w:r>
-          </w:p>
-        </w:tc>
-        <w:tc>
-          <w:tcPr>
-            <w:tcW w:w="902" w:type="dxa"/>
-            <w:vAlign w:val="center"/>
-          </w:tcPr>
-          <w:p>
-            <w:pPr>
-              <w:ind w:firstLine="0"/>
-              <w:jc w:val="center"/>
-              <w:rPr>
-                <w:lang w:val="pt-BR"/>
-              </w:rPr>
-            </w:pPr>
-            <w:r>
-              <w:rPr>
-                <w:lang w:val="pt-BR"/>
-              </w:rPr>
-              <w:t>4,8</w:t>
-            </w:r>
-          </w:p>
-        </w:tc>
-        <w:tc>
-          <w:tcPr>
-            <w:tcW w:w="902" w:type="dxa"/>
-            <w:vAlign w:val="center"/>
-          </w:tcPr>
-          <w:p>
-            <w:pPr>
-              <w:ind w:firstLine="0"/>
-              <w:jc w:val="center"/>
-              <w:rPr>
-                <w:lang w:val="pt-BR"/>
-              </w:rPr>
-            </w:pPr>
-            <w:r>
-              <w:rPr>
-                <w:lang w:val="pt-BR"/>
-              </w:rPr>
-              <w:t>5,0</w:t>
-            </w:r>
-          </w:p>
-        </w:tc>
-      </w:tr>
-      <w:tr>
-        <w:tc>
-          <w:tcPr>
-            <w:tcW w:w="2552" w:type="dxa"/>
-            <w:vAlign w:val="center"/>
-          </w:tcPr>
-          <w:p>
-            <w:pPr>
-              <w:ind w:firstLine="0"/>
-              <w:jc w:val="center"/>
-              <w:rPr>
-                <w:lang w:val="pt-BR"/>
-              </w:rPr>
-            </w:pPr>
-            <w:r>
-              <w:rPr>
-                <w:lang w:val="pt-BR"/>
-              </w:rPr>
-              <w:t>Distância (m)</w:t>
-            </w:r>
-          </w:p>
-        </w:tc>
-        <w:tc>
-          <w:tcPr>
-            <w:tcW w:w="941" w:type="dxa"/>
-            <w:vAlign w:val="center"/>
-          </w:tcPr>
-          <w:p>
-            <w:pPr>
-              <w:ind w:firstLine="0"/>
-              <w:jc w:val="center"/>
-              <w:rPr>
-                <w:lang w:val="pt-BR"/>
-              </w:rPr>
-            </w:pPr>
-            <w:r>
-              <w:rPr>
-                <w:lang w:val="pt-BR"/>
-              </w:rPr>
-              <w:t>10,0</w:t>
-            </w:r>
-          </w:p>
-        </w:tc>
-        <w:tc>
-          <w:tcPr>
-            <w:tcW w:w="941" w:type="dxa"/>
-            <w:vAlign w:val="center"/>
-          </w:tcPr>
-          <w:p>
-            <w:pPr>
-              <w:ind w:firstLine="0"/>
-              <w:jc w:val="center"/>
-              <w:rPr>
-                <w:lang w:val="pt-BR"/>
-              </w:rPr>
-            </w:pPr>
-            <w:r>
-              <w:rPr>
-                <w:lang w:val="pt-BR"/>
-              </w:rPr>
-              <w:t>11,02</w:t>
-            </w:r>
-          </w:p>
-        </w:tc>
-        <w:tc>
-          <w:tcPr>
-            <w:tcW w:w="941" w:type="dxa"/>
-            <w:vAlign w:val="center"/>
-          </w:tcPr>
-          <w:p>
-            <w:pPr>
-              <w:ind w:firstLine="0"/>
-              <w:jc w:val="center"/>
-              <w:rPr>
-                <w:lang w:val="pt-BR"/>
-              </w:rPr>
-            </w:pPr>
-            <w:r>
-              <w:rPr>
-                <w:lang w:val="pt-BR"/>
-              </w:rPr>
-              <w:t>12,16</w:t>
-            </w:r>
-          </w:p>
-        </w:tc>
-        <w:tc>
-          <w:tcPr>
-            <w:tcW w:w="901" w:type="dxa"/>
-            <w:vAlign w:val="center"/>
-          </w:tcPr>
-          <w:p>
-            <w:pPr>
-              <w:ind w:firstLine="0"/>
-              <w:jc w:val="center"/>
-              <w:rPr>
-                <w:lang w:val="pt-BR"/>
-              </w:rPr>
-            </w:pPr>
-            <w:r>
-              <w:rPr>
-                <w:lang w:val="pt-BR"/>
-              </w:rPr>
-              <w:t>13,45</w:t>
-            </w:r>
-          </w:p>
-        </w:tc>
-        <w:tc>
-          <w:tcPr>
-            <w:tcW w:w="902" w:type="dxa"/>
-            <w:vAlign w:val="center"/>
-          </w:tcPr>
-          <w:p>
-            <w:pPr>
-              <w:ind w:firstLine="0"/>
-              <w:jc w:val="center"/>
-              <w:rPr>
-                <w:lang w:val="pt-BR"/>
-              </w:rPr>
-            </w:pPr>
-            <w:r>
-              <w:rPr>
-                <w:lang w:val="pt-BR"/>
-              </w:rPr>
-              <w:t>14,96</w:t>
-            </w:r>
-          </w:p>
-        </w:tc>
-        <w:tc>
-          <w:tcPr>
-            <w:tcW w:w="902" w:type="dxa"/>
-            <w:vAlign w:val="center"/>
-          </w:tcPr>
-          <w:p>
-            <w:pPr>
-              <w:ind w:firstLine="0"/>
-              <w:jc w:val="center"/>
-              <w:rPr>
-                <w:lang w:val="pt-BR"/>
-              </w:rPr>
-            </w:pPr>
-            <w:r>
-              <w:rPr>
-                <w:lang w:val="pt-BR"/>
-              </w:rPr>
-              <w:t>16,80</w:t>
-            </w:r>
-          </w:p>
-        </w:tc>
-      </w:tr>
-    </w:tbl>
-    <w:p>
-      <w:pPr>
-        <w:pStyle w:val="Legenda"/>
-        <w:rPr>
-          <w:lang w:val="pt-BR"/>
-        </w:rPr>
-      </w:pPr>
-      <w:r>
-        <w:rPr>
-          <w:lang w:val="pt-BR"/>
-        </w:rPr>
-        <w:t>Fonte: Stewart (2012)</w:t>
-      </w:r>
-    </w:p>
-    <w:p>
-      <w:pPr>
-        <w:rPr>
-          <w:lang w:val="pt-BR"/>
-        </w:rPr>
-      </w:pPr>
-    </w:p>
-    <w:p>
-      <w:pPr>
-        <w:rPr>
-          <w:lang w:val="pt-BR"/>
-        </w:rPr>
-      </w:pPr>
-      <w:r>
-        <w:rPr>
-          <w:lang w:val="pt-BR"/>
-        </w:rPr>
-        <w:t>A equação 1 mostra...</w:t>
-      </w:r>
-    </w:p>
-    <w:tbl>
-      <w:tblPr>
-        <w:tblStyle w:val="Tabelacomgrade"/>
-        <w:tblW w:w="0" w:type="auto"/>
-        <w:tblInd w:w="108" w:type="dxa"/>
-        <w:tblBorders>
-          <w:top w:val="none" w:sz="0" w:space="0" w:color="auto"/>
-          <w:left w:val="none" w:sz="0" w:space="0" w:color="auto"/>
-          <w:bottom w:val="none" w:sz="0" w:space="0" w:color="auto"/>
-          <w:right w:val="none" w:sz="0" w:space="0" w:color="auto"/>
-          <w:insideH w:val="none" w:sz="0" w:space="0" w:color="auto"/>
-          <w:insideV w:val="none" w:sz="0" w:space="0" w:color="auto"/>
-        </w:tblBorders>
-        <w:tblLook w:val="04A0" w:firstRow="1" w:lastRow="0" w:firstColumn="1" w:lastColumn="0" w:noHBand="0" w:noVBand="1"/>
-      </w:tblPr>
-      <w:tblGrid>
-        <w:gridCol w:w="8364"/>
-        <w:gridCol w:w="708"/>
-      </w:tblGrid>
-      <w:tr>
-        <w:trPr>
-          <w:trHeight w:val="715"/>
-        </w:trPr>
-        <w:tc>
-          <w:tcPr>
-            <w:tcW w:w="8364" w:type="dxa"/>
-            <w:vAlign w:val="center"/>
-          </w:tcPr>
-          <w:p>
-            <w:pPr>
-              <w:rPr>
-                <w:sz w:val="24"/>
-                <w:szCs w:val="24"/>
-              </w:rPr>
-            </w:pPr>
-            <m:oMathPara>
-              <m:oMathParaPr>
-                <m:jc m:val="left"/>
-              </m:oMathParaPr>
-              <m:oMath>
-                <m:r>
-                  <w:rPr>
-                    <w:rFonts w:ascii="Cambria Math" w:hAnsi="Cambria Math"/>
-                    <w:sz w:val="24"/>
-                    <w:szCs w:val="24"/>
-                  </w:rPr>
-                  <m:t>P</m:t>
-                </m:r>
-                <m:d>
-                  <m:dPr>
-                    <m:ctrlPr>
-                      <w:rPr>
-                        <w:rFonts w:ascii="Cambria Math" w:hAnsi="Cambria Math"/>
-                        <w:sz w:val="24"/>
-                        <w:szCs w:val="24"/>
-                      </w:rPr>
-                    </m:ctrlPr>
-                  </m:dPr>
-                  <m:e>
-                    <m:r>
-                      <w:rPr>
-                        <w:rFonts w:ascii="Cambria Math" w:hAnsi="Cambria Math"/>
-                        <w:sz w:val="24"/>
-                        <w:szCs w:val="24"/>
-                      </w:rPr>
-                      <m:t>t</m:t>
-                    </m:r>
-                  </m:e>
-                </m:d>
-                <m:r>
-                  <m:rPr>
-                    <m:sty m:val="p"/>
-                  </m:rPr>
-                  <w:rPr>
-                    <w:rFonts w:ascii="Cambria Math" w:hAnsi="Cambria Math"/>
-                    <w:sz w:val="24"/>
-                    <w:szCs w:val="24"/>
-                  </w:rPr>
-                  <m:t xml:space="preserve">= </m:t>
-                </m:r>
-                <m:d>
-                  <m:dPr>
-                    <m:ctrlPr>
-                      <w:rPr>
-                        <w:rFonts w:ascii="Cambria Math" w:hAnsi="Cambria Math"/>
-                        <w:sz w:val="24"/>
-                        <w:szCs w:val="24"/>
-                      </w:rPr>
-                    </m:ctrlPr>
-                  </m:dPr>
-                  <m:e>
-                    <m:m>
-                      <m:mPr>
-                        <m:mcs>
-                          <m:mc>
-                            <m:mcPr>
-                              <m:count m:val="1"/>
-                              <m:mcJc m:val="center"/>
-                            </m:mcPr>
-                          </m:mc>
-                        </m:mcs>
-                        <m:ctrlPr>
-                          <w:rPr>
-                            <w:rFonts w:ascii="Cambria Math" w:hAnsi="Cambria Math"/>
-                            <w:sz w:val="24"/>
-                            <w:szCs w:val="24"/>
-                          </w:rPr>
-                        </m:ctrlPr>
-                      </m:mPr>
-                      <m:mr>
-                        <m:e>
-                          <m:r>
-                            <w:rPr>
-                              <w:rFonts w:ascii="Cambria Math" w:hAnsi="Cambria Math"/>
-                              <w:sz w:val="24"/>
-                              <w:szCs w:val="24"/>
-                            </w:rPr>
-                            <m:t>n</m:t>
-                          </m:r>
-                        </m:e>
-                      </m:mr>
-                      <m:mr>
-                        <m:e>
-                          <m:r>
-                            <w:rPr>
-                              <w:rFonts w:ascii="Cambria Math" w:hAnsi="Cambria Math"/>
-                              <w:sz w:val="24"/>
-                              <w:szCs w:val="24"/>
-                            </w:rPr>
-                            <m:t>i</m:t>
-                          </m:r>
-                        </m:e>
-                      </m:mr>
-                    </m:m>
-                  </m:e>
-                </m:d>
-                <m:sSup>
-                  <m:sSupPr>
-                    <m:ctrlPr>
-                      <w:rPr>
-                        <w:rFonts w:ascii="Cambria Math" w:hAnsi="Cambria Math"/>
-                        <w:sz w:val="24"/>
-                        <w:szCs w:val="24"/>
-                      </w:rPr>
-                    </m:ctrlPr>
-                  </m:sSupPr>
-                  <m:e>
-                    <m:d>
-                      <m:dPr>
-                        <m:ctrlPr>
-                          <w:rPr>
-                            <w:rFonts w:ascii="Cambria Math" w:hAnsi="Cambria Math"/>
-                            <w:sz w:val="24"/>
-                            <w:szCs w:val="24"/>
-                          </w:rPr>
-                        </m:ctrlPr>
-                      </m:dPr>
-                      <m:e>
-                        <m:r>
-                          <m:rPr>
-                            <m:sty m:val="p"/>
-                          </m:rPr>
-                          <w:rPr>
-                            <w:rFonts w:ascii="Cambria Math" w:hAnsi="Cambria Math"/>
-                            <w:sz w:val="24"/>
-                            <w:szCs w:val="24"/>
-                          </w:rPr>
-                          <m:t>1-</m:t>
-                        </m:r>
-                        <m:r>
-                          <w:rPr>
-                            <w:rFonts w:ascii="Cambria Math" w:hAnsi="Cambria Math"/>
-                            <w:sz w:val="24"/>
-                            <w:szCs w:val="24"/>
-                          </w:rPr>
-                          <m:t>t</m:t>
-                        </m:r>
-                      </m:e>
-                    </m:d>
-                  </m:e>
-                  <m:sup>
-                    <m:r>
-                      <w:rPr>
-                        <w:rFonts w:ascii="Cambria Math" w:hAnsi="Cambria Math"/>
-                        <w:sz w:val="24"/>
-                        <w:szCs w:val="24"/>
-                      </w:rPr>
-                      <m:t>n</m:t>
-                    </m:r>
-                    <m:r>
-                      <m:rPr>
-                        <m:sty m:val="p"/>
-                      </m:rPr>
-                      <w:rPr>
-                        <w:rFonts w:ascii="Cambria Math" w:hAnsi="Cambria Math"/>
-                        <w:sz w:val="24"/>
-                        <w:szCs w:val="24"/>
-                      </w:rPr>
-                      <m:t>-</m:t>
-                    </m:r>
-                    <m:r>
-                      <w:rPr>
-                        <w:rFonts w:ascii="Cambria Math" w:hAnsi="Cambria Math"/>
-                        <w:sz w:val="24"/>
-                        <w:szCs w:val="24"/>
-                      </w:rPr>
-                      <m:t>i</m:t>
-                    </m:r>
-                  </m:sup>
-                </m:sSup>
-                <m:sSup>
-                  <m:sSupPr>
-                    <m:ctrlPr>
-                      <w:rPr>
-                        <w:rFonts w:ascii="Cambria Math" w:hAnsi="Cambria Math"/>
-                        <w:sz w:val="24"/>
-                        <w:szCs w:val="24"/>
-                      </w:rPr>
-                    </m:ctrlPr>
-                  </m:sSupPr>
-                  <m:e>
-                    <m:r>
-                      <w:rPr>
-                        <w:rFonts w:ascii="Cambria Math" w:hAnsi="Cambria Math"/>
-                        <w:sz w:val="24"/>
-                        <w:szCs w:val="24"/>
-                      </w:rPr>
-                      <m:t>t</m:t>
-                    </m:r>
-                  </m:e>
-                  <m:sup>
-                    <m:r>
-                      <w:rPr>
-                        <w:rFonts w:ascii="Cambria Math" w:hAnsi="Cambria Math"/>
-                        <w:sz w:val="24"/>
-                        <w:szCs w:val="24"/>
-                      </w:rPr>
-                      <m:t>i</m:t>
-                    </m:r>
-                  </m:sup>
-                </m:sSup>
-              </m:oMath>
-            </m:oMathPara>
-          </w:p>
-        </w:tc>
-        <w:tc>
-          <w:tcPr>
-            <w:tcW w:w="708" w:type="dxa"/>
-            <w:vAlign w:val="center"/>
-          </w:tcPr>
-          <w:p>
-            <w:pPr>
-              <w:pStyle w:val="Legenda"/>
-              <w:jc w:val="right"/>
-              <w:rPr>
-                <w:lang w:val="pt-BR"/>
-              </w:rPr>
-            </w:pPr>
-            <w:bookmarkStart w:id="17" w:name="_Ref365105993"/>
-            <w:r>
-              <w:rPr>
-                <w:lang w:val="pt-BR"/>
-              </w:rPr>
-              <w:t>(</w:t>
-            </w:r>
-            <w:r>
-              <w:rPr>
-                <w:lang w:val="pt-BR"/>
-              </w:rPr>
-              <w:fldChar w:fldCharType="begin"/>
-            </w:r>
-            <w:r>
-              <w:rPr>
-                <w:lang w:val="pt-BR"/>
-              </w:rPr>
-              <w:instrText xml:space="preserve"> SEQ Equação \* ARABIC </w:instrText>
-            </w:r>
-            <w:r>
-              <w:rPr>
-                <w:lang w:val="pt-BR"/>
-              </w:rPr>
-              <w:fldChar w:fldCharType="separate"/>
-            </w:r>
-            <w:r>
-              <w:rPr>
-                <w:noProof/>
-                <w:lang w:val="pt-BR"/>
-              </w:rPr>
-              <w:t>1</w:t>
-            </w:r>
-            <w:r>
-              <w:rPr>
-                <w:lang w:val="pt-BR"/>
-              </w:rPr>
-              <w:fldChar w:fldCharType="end"/>
-            </w:r>
-            <w:bookmarkEnd w:id="17"/>
-            <w:r>
-              <w:rPr>
-                <w:lang w:val="pt-BR"/>
-              </w:rPr>
-              <w:t>)</w:t>
-            </w:r>
-          </w:p>
-        </w:tc>
-      </w:tr>
-    </w:tbl>
-    <w:p>
-      <w:pPr>
-        <w:rPr>
-          <w:lang w:val="pt-BR"/>
-        </w:rPr>
-      </w:pPr>
-    </w:p>
-    <w:p>
-      <w:pPr>
-        <w:rPr>
-          <w:lang w:val="pt-BR"/>
-        </w:rPr>
-      </w:pPr>
-      <w:r>
-        <w:rPr>
-          <w:lang w:val="pt-BR"/>
-        </w:rPr>
-        <w:t xml:space="preserve">Detalhes adicionais sobre a como mencionar as figuras, as tabelas e as equações, </w:t>
-      </w:r>
-      <w:proofErr w:type="gramStart"/>
-      <w:r>
-        <w:rPr>
-          <w:lang w:val="pt-BR"/>
-        </w:rPr>
-        <w:t>o(</w:t>
-      </w:r>
-      <w:proofErr w:type="gramEnd"/>
-      <w:r>
-        <w:rPr>
-          <w:lang w:val="pt-BR"/>
-        </w:rPr>
-        <w:t>a) candidato(a) deve consultar a norma NBR 14724.</w:t>
-      </w:r>
-    </w:p>
-    <w:p>
-      <w:pPr>
-        <w:pStyle w:val="Ttulo1"/>
-      </w:pPr>
-      <w:bookmarkStart w:id="18" w:name="_Toc365129138"/>
-      <w:bookmarkEnd w:id="10"/>
-      <w:r>
-        <w:lastRenderedPageBreak/>
-        <w:t>Referências</w:t>
-      </w:r>
-      <w:bookmarkEnd w:id="18"/>
     </w:p>
     <w:p>
       <w:r>
@@ -6654,7 +6104,10 @@
         <w:t>Publishing, 2023. Disponível em: &lt;</w:t>
       </w:r>
       <w:r>
-        <w:t>https://www.oecd.org/en/publications/oecd-employment-outlook-2023_08785bba-en/full-report/artificial-intelligence-job-quality-and-inclusiveness_a713d0ad.html?utm_source=chatgpt.com</w:t>
+        <w:t>https://www.oecd.org/en/publications/oecd-employment-outlook-2023_08785bba-en/full-report/artificial-intelligence-job-quality-and-inc</w:t>
+      </w:r>
+      <w:r>
+        <w:t>lusiveness_a713d0ad.html</w:t>
       </w:r>
       <w:r>
         <w:t>&gt;</w:t>
@@ -6734,6 +6187,7 @@
     </w:p>
     <w:p>
       <w:r>
+        <w:lastRenderedPageBreak/>
         <w:t xml:space="preserve">IPSOS. </w:t>
       </w:r>
       <w:r>
@@ -6798,6 +6252,11 @@
       </w:r>
     </w:p>
     <w:p>
+      <w:pPr>
+        <w:rPr>
+          <w:u w:val="single"/>
+        </w:rPr>
+      </w:pPr>
       <w:r>
         <w:t xml:space="preserve">TEXEIRA, João. </w:t>
       </w:r>
@@ -6814,7 +6273,15 @@
         <w:t>.</w:t>
       </w:r>
       <w:r>
-        <w:t xml:space="preserve"> 3. Ed. São Paulo: E-Galáxia, 2019. 64 p.</w:t>
+        <w:t xml:space="preserve"> 3. Ed. São Paulo: E-Galáxia, 2019. </w:t>
+      </w:r>
+      <w:proofErr w:type="gramStart"/>
+      <w:r>
+        <w:t>64</w:t>
+      </w:r>
+      <w:proofErr w:type="gramEnd"/>
+      <w:r>
+        <w:t xml:space="preserve"> p.</w:t>
       </w:r>
     </w:p>
     <w:sectPr>
@@ -6920,7 +6387,7 @@
           <w:rPr>
             <w:noProof/>
           </w:rPr>
-          <w:t>ii</w:t>
+          <w:t>viii</w:t>
         </w:r>
         <w:r>
           <w:rPr>
@@ -6954,7 +6421,7 @@
       <w:rPr>
         <w:noProof/>
       </w:rPr>
-      <w:t>9</w:t>
+      <w:t>16</w:t>
     </w:r>
     <w:r>
       <w:rPr>
@@ -8689,6 +8156,21 @@
       <w:u w:val="single"/>
     </w:rPr>
   </w:style>
+  <w:style w:type="paragraph" w:customStyle="1" w:styleId="isselectedend">
+    <w:name w:val="isselectedend"/>
+    <w:basedOn w:val="Normal"/>
+    <w:rsid w:val="00812382"/>
+    <w:pPr>
+      <w:spacing w:before="100" w:beforeAutospacing="1" w:after="100" w:afterAutospacing="1" w:line="240" w:lineRule="auto"/>
+      <w:ind w:firstLine="0"/>
+      <w:jc w:val="left"/>
+    </w:pPr>
+    <w:rPr>
+      <w:rFonts w:ascii="Times New Roman" w:eastAsia="Times New Roman" w:hAnsi="Times New Roman" w:cs="Times New Roman"/>
+      <w:szCs w:val="24"/>
+      <w:lang w:val="pt-BR" w:eastAsia="pt-BR"/>
+    </w:rPr>
+  </w:style>
 </w:styles>
 </file>
 
@@ -9004,7 +8486,7 @@
 </file>
 
 <file path=customXml/itemProps1.xml><?xml version="1.0" encoding="utf-8"?>
-<ds:datastoreItem xmlns:ds="http://schemas.openxmlformats.org/officeDocument/2006/customXml" ds:itemID="{ECB614B7-855B-429E-B812-22F5203BFD55}">
+<ds:datastoreItem xmlns:ds="http://schemas.openxmlformats.org/officeDocument/2006/customXml" ds:itemID="{8133620E-D8F0-4B39-BD97-FFEB3A91FDAC}">
   <ds:schemaRefs>
     <ds:schemaRef ds:uri="http://schemas.openxmlformats.org/officeDocument/2006/bibliography"/>
   </ds:schemaRefs>

</xml_diff>